<commit_message>
feat: updated labex report
</commit_message>
<xml_diff>
--- a/Cybersecurity/labex.docx
+++ b/Cybersecurity/labex.docx
@@ -949,6 +949,7 @@
       </w:pPr>
       <w:r>
         <w:rPr>
+          <w:noProof/>
           <w:lang w:val="en-US"/>
         </w:rPr>
         <w:drawing>
@@ -989,6 +990,7 @@
       </w:r>
       <w:r>
         <w:rPr>
+          <w:noProof/>
           <w:lang w:val="en-US"/>
         </w:rPr>
         <w:drawing>
@@ -1037,6 +1039,7 @@
       </w:pPr>
       <w:r>
         <w:rPr>
+          <w:noProof/>
           <w:lang w:val="en-US"/>
         </w:rPr>
         <w:drawing>
@@ -1085,6 +1088,7 @@
       </w:pPr>
       <w:r>
         <w:rPr>
+          <w:noProof/>
           <w:lang w:val="en-US"/>
         </w:rPr>
         <w:lastRenderedPageBreak/>
@@ -1134,6 +1138,7 @@
       </w:pPr>
       <w:r>
         <w:rPr>
+          <w:noProof/>
           <w:lang w:val="en-US"/>
         </w:rPr>
         <w:drawing>
@@ -1182,6 +1187,7 @@
       </w:pPr>
       <w:r>
         <w:rPr>
+          <w:noProof/>
           <w:lang w:val="en-US"/>
         </w:rPr>
         <w:drawing>
@@ -1230,6 +1236,7 @@
       </w:pPr>
       <w:r>
         <w:rPr>
+          <w:noProof/>
           <w:lang w:val="en-US"/>
         </w:rPr>
         <w:drawing>
@@ -1278,6 +1285,7 @@
       </w:pPr>
       <w:r>
         <w:rPr>
+          <w:noProof/>
           <w:lang w:val="en-US"/>
         </w:rPr>
         <w:lastRenderedPageBreak/>
@@ -1327,6 +1335,7 @@
       </w:pPr>
       <w:r>
         <w:rPr>
+          <w:noProof/>
           <w:lang w:val="en-US"/>
         </w:rPr>
         <w:drawing>
@@ -1401,6 +1410,356 @@
       <w:proofErr w:type="spellEnd"/>
       <w:r>
         <w:t xml:space="preserve"> Challenge</w:t>
+      </w:r>
+    </w:p>
+    <w:p>
+      <w:pPr>
+        <w:ind w:left="360"/>
+        <w:rPr>
+          <w:lang w:val="en-US"/>
+        </w:rPr>
+      </w:pPr>
+      <w:r>
+        <w:rPr>
+          <w:lang w:val="en-US"/>
+        </w:rPr>
+        <w:lastRenderedPageBreak/>
+        <w:drawing>
+          <wp:inline distT="0" distB="0" distL="0" distR="0" wp14:anchorId="363523EC" wp14:editId="336F34BC">
+            <wp:extent cx="5940425" cy="4418330"/>
+            <wp:effectExtent l="0" t="0" r="3175" b="1270"/>
+            <wp:docPr id="1700188366" name="Рисунок 1"/>
+            <wp:cNvGraphicFramePr>
+              <a:graphicFrameLocks xmlns:a="http://schemas.openxmlformats.org/drawingml/2006/main" noChangeAspect="1"/>
+            </wp:cNvGraphicFramePr>
+            <a:graphic xmlns:a="http://schemas.openxmlformats.org/drawingml/2006/main">
+              <a:graphicData uri="http://schemas.openxmlformats.org/drawingml/2006/picture">
+                <pic:pic xmlns:pic="http://schemas.openxmlformats.org/drawingml/2006/picture">
+                  <pic:nvPicPr>
+                    <pic:cNvPr id="1700188366" name=""/>
+                    <pic:cNvPicPr/>
+                  </pic:nvPicPr>
+                  <pic:blipFill>
+                    <a:blip r:embed="rId27"/>
+                    <a:stretch>
+                      <a:fillRect/>
+                    </a:stretch>
+                  </pic:blipFill>
+                  <pic:spPr>
+                    <a:xfrm>
+                      <a:off x="0" y="0"/>
+                      <a:ext cx="5940425" cy="4418330"/>
+                    </a:xfrm>
+                    <a:prstGeom prst="rect">
+                      <a:avLst/>
+                    </a:prstGeom>
+                  </pic:spPr>
+                </pic:pic>
+              </a:graphicData>
+            </a:graphic>
+          </wp:inline>
+        </w:drawing>
+      </w:r>
+    </w:p>
+    <w:p>
+      <w:pPr>
+        <w:ind w:left="360"/>
+        <w:rPr>
+          <w:lang w:val="en-US"/>
+        </w:rPr>
+      </w:pPr>
+      <w:r>
+        <w:rPr>
+          <w:lang w:val="en-US"/>
+        </w:rPr>
+        <w:drawing>
+          <wp:inline distT="0" distB="0" distL="0" distR="0" wp14:anchorId="2CAF62AA" wp14:editId="18C7AAFE">
+            <wp:extent cx="5940425" cy="514985"/>
+            <wp:effectExtent l="0" t="0" r="3175" b="0"/>
+            <wp:docPr id="1100244499" name="Рисунок 1"/>
+            <wp:cNvGraphicFramePr>
+              <a:graphicFrameLocks xmlns:a="http://schemas.openxmlformats.org/drawingml/2006/main" noChangeAspect="1"/>
+            </wp:cNvGraphicFramePr>
+            <a:graphic xmlns:a="http://schemas.openxmlformats.org/drawingml/2006/main">
+              <a:graphicData uri="http://schemas.openxmlformats.org/drawingml/2006/picture">
+                <pic:pic xmlns:pic="http://schemas.openxmlformats.org/drawingml/2006/picture">
+                  <pic:nvPicPr>
+                    <pic:cNvPr id="1100244499" name=""/>
+                    <pic:cNvPicPr/>
+                  </pic:nvPicPr>
+                  <pic:blipFill>
+                    <a:blip r:embed="rId28"/>
+                    <a:stretch>
+                      <a:fillRect/>
+                    </a:stretch>
+                  </pic:blipFill>
+                  <pic:spPr>
+                    <a:xfrm>
+                      <a:off x="0" y="0"/>
+                      <a:ext cx="5940425" cy="514985"/>
+                    </a:xfrm>
+                    <a:prstGeom prst="rect">
+                      <a:avLst/>
+                    </a:prstGeom>
+                  </pic:spPr>
+                </pic:pic>
+              </a:graphicData>
+            </a:graphic>
+          </wp:inline>
+        </w:drawing>
+      </w:r>
+      <w:r>
+        <w:rPr>
+          <w:lang w:val="en-US"/>
+        </w:rPr>
+        <w:drawing>
+          <wp:inline distT="0" distB="0" distL="0" distR="0" wp14:anchorId="38D90297" wp14:editId="78452FD2">
+            <wp:extent cx="5744377" cy="1314633"/>
+            <wp:effectExtent l="0" t="0" r="8890" b="0"/>
+            <wp:docPr id="949362384" name="Рисунок 1"/>
+            <wp:cNvGraphicFramePr>
+              <a:graphicFrameLocks xmlns:a="http://schemas.openxmlformats.org/drawingml/2006/main" noChangeAspect="1"/>
+            </wp:cNvGraphicFramePr>
+            <a:graphic xmlns:a="http://schemas.openxmlformats.org/drawingml/2006/main">
+              <a:graphicData uri="http://schemas.openxmlformats.org/drawingml/2006/picture">
+                <pic:pic xmlns:pic="http://schemas.openxmlformats.org/drawingml/2006/picture">
+                  <pic:nvPicPr>
+                    <pic:cNvPr id="949362384" name=""/>
+                    <pic:cNvPicPr/>
+                  </pic:nvPicPr>
+                  <pic:blipFill>
+                    <a:blip r:embed="rId29"/>
+                    <a:stretch>
+                      <a:fillRect/>
+                    </a:stretch>
+                  </pic:blipFill>
+                  <pic:spPr>
+                    <a:xfrm>
+                      <a:off x="0" y="0"/>
+                      <a:ext cx="5744377" cy="1314633"/>
+                    </a:xfrm>
+                    <a:prstGeom prst="rect">
+                      <a:avLst/>
+                    </a:prstGeom>
+                  </pic:spPr>
+                </pic:pic>
+              </a:graphicData>
+            </a:graphic>
+          </wp:inline>
+        </w:drawing>
+      </w:r>
+    </w:p>
+    <w:p>
+      <w:pPr>
+        <w:ind w:left="360"/>
+        <w:rPr>
+          <w:lang w:val="en-US"/>
+        </w:rPr>
+      </w:pPr>
+      <w:r>
+        <w:rPr>
+          <w:lang w:val="en-US"/>
+        </w:rPr>
+        <w:drawing>
+          <wp:inline distT="0" distB="0" distL="0" distR="0" wp14:anchorId="10C12266" wp14:editId="642866ED">
+            <wp:extent cx="5940425" cy="1201420"/>
+            <wp:effectExtent l="0" t="0" r="3175" b="0"/>
+            <wp:docPr id="1702804793" name="Рисунок 1"/>
+            <wp:cNvGraphicFramePr>
+              <a:graphicFrameLocks xmlns:a="http://schemas.openxmlformats.org/drawingml/2006/main" noChangeAspect="1"/>
+            </wp:cNvGraphicFramePr>
+            <a:graphic xmlns:a="http://schemas.openxmlformats.org/drawingml/2006/main">
+              <a:graphicData uri="http://schemas.openxmlformats.org/drawingml/2006/picture">
+                <pic:pic xmlns:pic="http://schemas.openxmlformats.org/drawingml/2006/picture">
+                  <pic:nvPicPr>
+                    <pic:cNvPr id="1702804793" name=""/>
+                    <pic:cNvPicPr/>
+                  </pic:nvPicPr>
+                  <pic:blipFill>
+                    <a:blip r:embed="rId30"/>
+                    <a:stretch>
+                      <a:fillRect/>
+                    </a:stretch>
+                  </pic:blipFill>
+                  <pic:spPr>
+                    <a:xfrm>
+                      <a:off x="0" y="0"/>
+                      <a:ext cx="5940425" cy="1201420"/>
+                    </a:xfrm>
+                    <a:prstGeom prst="rect">
+                      <a:avLst/>
+                    </a:prstGeom>
+                  </pic:spPr>
+                </pic:pic>
+              </a:graphicData>
+            </a:graphic>
+          </wp:inline>
+        </w:drawing>
+      </w:r>
+    </w:p>
+    <w:p>
+      <w:pPr>
+        <w:pStyle w:val="a7"/>
+        <w:numPr>
+          <w:ilvl w:val="0"/>
+          <w:numId w:val="1"/>
+        </w:numPr>
+        <w:rPr>
+          <w:lang w:val="en-US"/>
+        </w:rPr>
+      </w:pPr>
+      <w:proofErr w:type="spellStart"/>
+      <w:r>
+        <w:t>Weak</w:t>
+      </w:r>
+      <w:proofErr w:type="spellEnd"/>
+      <w:r>
+        <w:t xml:space="preserve"> Password Access</w:t>
+      </w:r>
+    </w:p>
+    <w:p>
+      <w:pPr>
+        <w:ind w:left="360"/>
+        <w:rPr>
+          <w:lang w:val="en-US"/>
+        </w:rPr>
+      </w:pPr>
+      <w:r>
+        <w:rPr>
+          <w:lang w:val="en-US"/>
+        </w:rPr>
+        <w:lastRenderedPageBreak/>
+        <w:drawing>
+          <wp:inline distT="0" distB="0" distL="0" distR="0" wp14:anchorId="58180A9A" wp14:editId="2D5BA79D">
+            <wp:extent cx="5106113" cy="1619476"/>
+            <wp:effectExtent l="0" t="0" r="0" b="0"/>
+            <wp:docPr id="1809534968" name="Рисунок 1"/>
+            <wp:cNvGraphicFramePr>
+              <a:graphicFrameLocks xmlns:a="http://schemas.openxmlformats.org/drawingml/2006/main" noChangeAspect="1"/>
+            </wp:cNvGraphicFramePr>
+            <a:graphic xmlns:a="http://schemas.openxmlformats.org/drawingml/2006/main">
+              <a:graphicData uri="http://schemas.openxmlformats.org/drawingml/2006/picture">
+                <pic:pic xmlns:pic="http://schemas.openxmlformats.org/drawingml/2006/picture">
+                  <pic:nvPicPr>
+                    <pic:cNvPr id="1809534968" name=""/>
+                    <pic:cNvPicPr/>
+                  </pic:nvPicPr>
+                  <pic:blipFill>
+                    <a:blip r:embed="rId31"/>
+                    <a:stretch>
+                      <a:fillRect/>
+                    </a:stretch>
+                  </pic:blipFill>
+                  <pic:spPr>
+                    <a:xfrm>
+                      <a:off x="0" y="0"/>
+                      <a:ext cx="5106113" cy="1619476"/>
+                    </a:xfrm>
+                    <a:prstGeom prst="rect">
+                      <a:avLst/>
+                    </a:prstGeom>
+                  </pic:spPr>
+                </pic:pic>
+              </a:graphicData>
+            </a:graphic>
+          </wp:inline>
+        </w:drawing>
+      </w:r>
+    </w:p>
+    <w:p>
+      <w:pPr>
+        <w:ind w:left="360"/>
+        <w:rPr>
+          <w:lang w:val="en-US"/>
+        </w:rPr>
+      </w:pPr>
+      <w:r>
+        <w:rPr>
+          <w:lang w:val="en-US"/>
+        </w:rPr>
+        <w:drawing>
+          <wp:inline distT="0" distB="0" distL="0" distR="0" wp14:anchorId="5BD415F0" wp14:editId="55608377">
+            <wp:extent cx="5940425" cy="970280"/>
+            <wp:effectExtent l="0" t="0" r="3175" b="1270"/>
+            <wp:docPr id="1546535996" name="Рисунок 1"/>
+            <wp:cNvGraphicFramePr>
+              <a:graphicFrameLocks xmlns:a="http://schemas.openxmlformats.org/drawingml/2006/main" noChangeAspect="1"/>
+            </wp:cNvGraphicFramePr>
+            <a:graphic xmlns:a="http://schemas.openxmlformats.org/drawingml/2006/main">
+              <a:graphicData uri="http://schemas.openxmlformats.org/drawingml/2006/picture">
+                <pic:pic xmlns:pic="http://schemas.openxmlformats.org/drawingml/2006/picture">
+                  <pic:nvPicPr>
+                    <pic:cNvPr id="1546535996" name=""/>
+                    <pic:cNvPicPr/>
+                  </pic:nvPicPr>
+                  <pic:blipFill>
+                    <a:blip r:embed="rId32"/>
+                    <a:stretch>
+                      <a:fillRect/>
+                    </a:stretch>
+                  </pic:blipFill>
+                  <pic:spPr>
+                    <a:xfrm>
+                      <a:off x="0" y="0"/>
+                      <a:ext cx="5940425" cy="970280"/>
+                    </a:xfrm>
+                    <a:prstGeom prst="rect">
+                      <a:avLst/>
+                    </a:prstGeom>
+                  </pic:spPr>
+                </pic:pic>
+              </a:graphicData>
+            </a:graphic>
+          </wp:inline>
+        </w:drawing>
+      </w:r>
+    </w:p>
+    <w:p>
+      <w:pPr>
+        <w:ind w:left="360"/>
+        <w:rPr>
+          <w:lang w:val="en-US"/>
+        </w:rPr>
+      </w:pPr>
+      <w:r>
+        <w:rPr>
+          <w:lang w:val="en-US"/>
+        </w:rPr>
+        <w:drawing>
+          <wp:inline distT="0" distB="0" distL="0" distR="0" wp14:anchorId="4CAB5D39" wp14:editId="02A9D739">
+            <wp:extent cx="5940425" cy="2468245"/>
+            <wp:effectExtent l="0" t="0" r="3175" b="8255"/>
+            <wp:docPr id="500098311" name="Рисунок 1"/>
+            <wp:cNvGraphicFramePr>
+              <a:graphicFrameLocks xmlns:a="http://schemas.openxmlformats.org/drawingml/2006/main" noChangeAspect="1"/>
+            </wp:cNvGraphicFramePr>
+            <a:graphic xmlns:a="http://schemas.openxmlformats.org/drawingml/2006/main">
+              <a:graphicData uri="http://schemas.openxmlformats.org/drawingml/2006/picture">
+                <pic:pic xmlns:pic="http://schemas.openxmlformats.org/drawingml/2006/picture">
+                  <pic:nvPicPr>
+                    <pic:cNvPr id="500098311" name=""/>
+                    <pic:cNvPicPr/>
+                  </pic:nvPicPr>
+                  <pic:blipFill>
+                    <a:blip r:embed="rId33"/>
+                    <a:stretch>
+                      <a:fillRect/>
+                    </a:stretch>
+                  </pic:blipFill>
+                  <pic:spPr>
+                    <a:xfrm>
+                      <a:off x="0" y="0"/>
+                      <a:ext cx="5940425" cy="2468245"/>
+                    </a:xfrm>
+                    <a:prstGeom prst="rect">
+                      <a:avLst/>
+                    </a:prstGeom>
+                  </pic:spPr>
+                </pic:pic>
+              </a:graphicData>
+            </a:graphic>
+          </wp:inline>
+        </w:drawing>
       </w:r>
     </w:p>
     <w:p>

</xml_diff>